<commit_message>
Ajustes do revisor-final, guia do pacote e pacote completo
Co-Authored-By: Claude Opus 5.5 <noreply@anthropic.com>
Claude-Session: https://claude.ai/code/session_01MBn9YrntdXfTASAVKo9hpN
</commit_message>
<xml_diff>
--- a/entregas/anexo-2-texto-apresentacao.docx
+++ b/entregas/anexo-2-texto-apresentacao.docx
@@ -141,7 +141,7 @@
           <w:b w:val="0"/>
           <w:i w:val="0"/>
         </w:rPr>
-        <w:t>O Efeito Rebote é um projeto de extensão do curso de Direito que discute um problema pouco visível: a falta de itens básicos de higiene nas unidades prisionais. A Lei de Execução Penal garante à pessoa presa assistência material e à saúde, mas, na prática, esse cuidado muitas vezes não chega. Quando falta o básico, surgem doenças, aumentam os gastos públicos com atendimentos e escoltas, e o custo acaba recaindo sobre as famílias — o que pode afastá-las das visitas, enfraquecendo um dos vínculos mais importantes para evitar a reincidência.</w:t>
+        <w:t>O Efeito Rebote é um projeto de extensão do curso de Direito que discute um problema pouco visível: a falta de itens básicos de higiene nas unidades prisionais. A Lei de Execução Penal garante à pessoa presa assistência material e à saúde, mas, na prática, esse cuidado muitas vezes não chega. Quando falta o básico, podem surgir doenças e aumentar a demanda por atendimentos e escoltas, e parte do custo acaba recaindo sobre as famílias, o que pode afastá-las das visitas e enfraquecer um dos vínculos mais importantes para evitar a reincidência.</w:t>
       </w:r>
     </w:p>
     <w:p>
@@ -154,7 +154,7 @@
           <w:b w:val="0"/>
           <w:i w:val="0"/>
         </w:rPr>
-        <w:t>É esse ciclo que chamamos de efeito rebote: economizar no que é preventivo sai muito mais caro depois, para o Estado e para toda a sociedade.</w:t>
+        <w:t>É esse ciclo que chamamos de efeito rebote: a hipótese de que economizar no que é preventivo pode gerar demandas maiores depois, para o Estado, para as famílias e para toda a sociedade.</w:t>
       </w:r>
     </w:p>
     <w:p>

</xml_diff>